<commit_message>
feat: add CV text extraction from private R2 storage
</commit_message>
<xml_diff>
--- a/backend/tests/fixtures/sample.docx
+++ b/backend/tests/fixtures/sample.docx
@@ -1,10 +1,20 @@
 
-<file path=word\document.xml><?xml version="1.0" encoding="utf-8"?>
+<file path=word/document.xml><?xml version="1.0" encoding="utf-8"?>
 <w:document xmlns:w="http://schemas.openxmlformats.org/wordprocessingml/2006/main">
   <w:body>
     <w:p>
       <w:r>
-        <w:t>Sample CV content.</w:t>
+        <w:t xml:space="preserve">Taylor Example</w:t>
+      </w:r>
+    </w:p>
+    <w:p>
+      <w:r>
+        <w:t xml:space="preserve">Backend Developer</w:t>
+      </w:r>
+    </w:p>
+    <w:p>
+      <w:r>
+        <w:t xml:space="preserve">5 years experience with Node.js, TypeScript, and MongoDB.</w:t>
       </w:r>
     </w:p>
   </w:body>

</xml_diff>